<commit_message>
Update customer-facing package doc with detailed schedule table and pricing
Co-Authored-By: Claude Sonnet 4.6 <noreply@anthropic.com>
Claude-Session: https://claude.ai/code/session_01MLXVgnN287g9x8qaYbB4vD
</commit_message>
<xml_diff>
--- a/packages/고객공유용_당일변신패키지.docx
+++ b/packages/고객공유용_당일변신패키지.docx
@@ -16,8 +16,17 @@
     </w:p>
     <w:p>
       <w:r>
+        <w:rPr>
+          <w:i/>
+        </w:rPr>
         <w:t>하루 안에 피부·외모 변화를 경험하는 K-뷰티 데이트립</w:t>
-        <w:br/>
+      </w:r>
+    </w:p>
+    <w:p>
+      <w:r>
+        <w:rPr>
+          <w:i/>
+        </w:rPr>
         <w:t>명동 전 구간 도보 이동 | 소그룹 운영</w:t>
       </w:r>
     </w:p>
@@ -28,393 +37,7 @@
         <w:jc w:val="left"/>
       </w:pPr>
       <w:r>
-        <w:t>💰 패키지 가격</w:t>
-      </w:r>
-    </w:p>
-    <w:tbl>
-      <w:tblPr>
-        <w:tblStyle w:val="TableGrid"/>
-        <w:tblW w:type="auto" w:w="0"/>
-        <w:tblLook w:firstColumn="1" w:firstRow="1" w:lastColumn="0" w:lastRow="0" w:noHBand="0" w:noVBand="1" w:val="04A0"/>
-      </w:tblPr>
-      <w:tblGrid>
-        <w:gridCol w:w="4320"/>
-        <w:gridCol w:w="4320"/>
-      </w:tblGrid>
-      <w:tr>
-        <w:tc>
-          <w:tcPr>
-            <w:tcW w:type="dxa" w:w="4320"/>
-            <w:shd w:val="clear" w:color="auto" w:fill="D9E2F3"/>
-          </w:tcPr>
-          <w:p>
-            <w:r>
-              <w:rPr>
-                <w:b/>
-                <w:sz w:val="20"/>
-              </w:rPr>
-              <w:t>구분</w:t>
-            </w:r>
-          </w:p>
-        </w:tc>
-        <w:tc>
-          <w:tcPr>
-            <w:tcW w:type="dxa" w:w="4320"/>
-            <w:shd w:val="clear" w:color="auto" w:fill="D9E2F3"/>
-          </w:tcPr>
-          <w:p>
-            <w:r>
-              <w:rPr>
-                <w:b/>
-                <w:sz w:val="20"/>
-              </w:rPr>
-              <w:t>가격</w:t>
-            </w:r>
-          </w:p>
-        </w:tc>
-      </w:tr>
-      <w:tr>
-        <w:tc>
-          <w:tcPr>
-            <w:tcW w:type="dxa" w:w="4320"/>
-          </w:tcPr>
-          <w:p>
-            <w:r>
-              <w:rPr>
-                <w:sz w:val="20"/>
-              </w:rPr>
-              <w:t>기본 패키지</w:t>
-            </w:r>
-          </w:p>
-        </w:tc>
-        <w:tc>
-          <w:tcPr>
-            <w:tcW w:type="dxa" w:w="4320"/>
-          </w:tcPr>
-          <w:p>
-            <w:r>
-              <w:rPr>
-                <w:sz w:val="20"/>
-              </w:rPr>
-              <w:t>₩399,000</w:t>
-            </w:r>
-          </w:p>
-        </w:tc>
-      </w:tr>
-      <w:tr>
-        <w:tc>
-          <w:tcPr>
-            <w:tcW w:type="dxa" w:w="4320"/>
-          </w:tcPr>
-          <w:p>
-            <w:r>
-              <w:rPr>
-                <w:sz w:val="20"/>
-              </w:rPr>
-              <w:t>큐레이터 동행</w:t>
-            </w:r>
-          </w:p>
-        </w:tc>
-        <w:tc>
-          <w:tcPr>
-            <w:tcW w:type="dxa" w:w="4320"/>
-          </w:tcPr>
-          <w:p>
-            <w:r>
-              <w:rPr>
-                <w:sz w:val="20"/>
-              </w:rPr>
-              <w:t>₩50,000~ 별도</w:t>
-            </w:r>
-          </w:p>
-        </w:tc>
-      </w:tr>
-    </w:tbl>
-    <w:p/>
-    <w:p>
-      <w:pPr>
-        <w:pStyle w:val="Heading2"/>
-        <w:jc w:val="left"/>
-      </w:pPr>
-      <w:r>
-        <w:t>📦 기본 패키지에 포함된 것</w:t>
-      </w:r>
-    </w:p>
-    <w:tbl>
-      <w:tblPr>
-        <w:tblStyle w:val="TableGrid"/>
-        <w:tblW w:type="auto" w:w="0"/>
-        <w:tblLook w:firstColumn="1" w:firstRow="1" w:lastColumn="0" w:lastRow="0" w:noHBand="0" w:noVBand="1" w:val="04A0"/>
-      </w:tblPr>
-      <w:tblGrid>
-        <w:gridCol w:w="4320"/>
-        <w:gridCol w:w="4320"/>
-      </w:tblGrid>
-      <w:tr>
-        <w:tc>
-          <w:tcPr>
-            <w:tcW w:type="dxa" w:w="4320"/>
-            <w:shd w:val="clear" w:color="auto" w:fill="D9E2F3"/>
-          </w:tcPr>
-          <w:p>
-            <w:r>
-              <w:rPr>
-                <w:b/>
-                <w:sz w:val="20"/>
-              </w:rPr>
-              <w:t>항목</w:t>
-            </w:r>
-          </w:p>
-        </w:tc>
-        <w:tc>
-          <w:tcPr>
-            <w:tcW w:type="dxa" w:w="4320"/>
-            <w:shd w:val="clear" w:color="auto" w:fill="D9E2F3"/>
-          </w:tcPr>
-          <w:p>
-            <w:r>
-              <w:rPr>
-                <w:b/>
-                <w:sz w:val="20"/>
-              </w:rPr>
-              <w:t>내용</w:t>
-            </w:r>
-          </w:p>
-        </w:tc>
-      </w:tr>
-      <w:tr>
-        <w:tc>
-          <w:tcPr>
-            <w:tcW w:type="dxa" w:w="4320"/>
-          </w:tcPr>
-          <w:p>
-            <w:r>
-              <w:rPr>
-                <w:sz w:val="20"/>
-              </w:rPr>
-              <w:t>퍼스널컬러 분석</w:t>
-            </w:r>
-          </w:p>
-        </w:tc>
-        <w:tc>
-          <w:tcPr>
-            <w:tcW w:type="dxa" w:w="4320"/>
-          </w:tcPr>
-          <w:p>
-            <w:r>
-              <w:rPr>
-                <w:sz w:val="20"/>
-              </w:rPr>
-              <w:t>웜/쿨톤 · 계절 유형 · 얼굴형 · 체형 분석</w:t>
-            </w:r>
-          </w:p>
-        </w:tc>
-      </w:tr>
-      <w:tr>
-        <w:tc>
-          <w:tcPr>
-            <w:tcW w:type="dxa" w:w="4320"/>
-          </w:tcPr>
-          <w:p>
-            <w:r>
-              <w:rPr>
-                <w:sz w:val="20"/>
-              </w:rPr>
-              <w:t>헤어 &amp; 메이크업</w:t>
-            </w:r>
-          </w:p>
-        </w:tc>
-        <w:tc>
-          <w:tcPr>
-            <w:tcW w:type="dxa" w:w="4320"/>
-          </w:tcPr>
-          <w:p>
-            <w:r>
-              <w:rPr>
-                <w:sz w:val="20"/>
-              </w:rPr>
-              <w:t>명동 제휴 헤어숍 스타일링 + 한국식 글로우 메이크업</w:t>
-            </w:r>
-          </w:p>
-        </w:tc>
-      </w:tr>
-      <w:tr>
-        <w:tc>
-          <w:tcPr>
-            <w:tcW w:type="dxa" w:w="4320"/>
-          </w:tcPr>
-          <w:p>
-            <w:r>
-              <w:rPr>
-                <w:sz w:val="20"/>
-              </w:rPr>
-              <w:t>프로필 촬영</w:t>
-            </w:r>
-          </w:p>
-        </w:tc>
-        <w:tc>
-          <w:tcPr>
-            <w:tcW w:type="dxa" w:w="4320"/>
-          </w:tcPr>
-          <w:p>
-            <w:r>
-              <w:rPr>
-                <w:sz w:val="20"/>
-              </w:rPr>
-              <w:t>실내 스튜디오 · 전문 포토그래퍼</w:t>
-            </w:r>
-          </w:p>
-        </w:tc>
-      </w:tr>
-      <w:tr>
-        <w:tc>
-          <w:tcPr>
-            <w:tcW w:type="dxa" w:w="4320"/>
-          </w:tcPr>
-          <w:p>
-            <w:r>
-              <w:rPr>
-                <w:sz w:val="20"/>
-              </w:rPr>
-              <w:t>한국 eSIM</w:t>
-            </w:r>
-          </w:p>
-        </w:tc>
-        <w:tc>
-          <w:tcPr>
-            <w:tcW w:type="dxa" w:w="4320"/>
-          </w:tcPr>
-          <w:p>
-            <w:r>
-              <w:rPr>
-                <w:sz w:val="20"/>
-              </w:rPr>
-              <w:t>여행 기간 데이터 사용</w:t>
-            </w:r>
-          </w:p>
-        </w:tc>
-      </w:tr>
-      <w:tr>
-        <w:tc>
-          <w:tcPr>
-            <w:tcW w:type="dxa" w:w="4320"/>
-          </w:tcPr>
-          <w:p>
-            <w:r>
-              <w:rPr>
-                <w:sz w:val="20"/>
-              </w:rPr>
-              <w:t>T-money 교통카드</w:t>
-            </w:r>
-          </w:p>
-        </w:tc>
-        <w:tc>
-          <w:tcPr>
-            <w:tcW w:type="dxa" w:w="4320"/>
-          </w:tcPr>
-          <w:p>
-            <w:r>
-              <w:rPr>
-                <w:sz w:val="20"/>
-              </w:rPr>
-              <w:t>대중교통 이용 가능</w:t>
-            </w:r>
-          </w:p>
-        </w:tc>
-      </w:tr>
-      <w:tr>
-        <w:tc>
-          <w:tcPr>
-            <w:tcW w:type="dxa" w:w="4320"/>
-          </w:tcPr>
-          <w:p>
-            <w:r>
-              <w:rPr>
-                <w:sz w:val="20"/>
-              </w:rPr>
-              <w:t>여행자 보험</w:t>
-            </w:r>
-          </w:p>
-        </w:tc>
-        <w:tc>
-          <w:tcPr>
-            <w:tcW w:type="dxa" w:w="4320"/>
-          </w:tcPr>
-          <w:p>
-            <w:r>
-              <w:rPr>
-                <w:sz w:val="20"/>
-              </w:rPr>
-              <w:t>당일 여행 중 보장</w:t>
-            </w:r>
-          </w:p>
-        </w:tc>
-      </w:tr>
-      <w:tr>
-        <w:tc>
-          <w:tcPr>
-            <w:tcW w:type="dxa" w:w="4320"/>
-          </w:tcPr>
-          <w:p>
-            <w:r>
-              <w:rPr>
-                <w:sz w:val="20"/>
-              </w:rPr>
-              <w:t>업체별 예약 확인서</w:t>
-            </w:r>
-          </w:p>
-        </w:tc>
-        <w:tc>
-          <w:tcPr>
-            <w:tcW w:type="dxa" w:w="4320"/>
-          </w:tcPr>
-          <w:p>
-            <w:r>
-              <w:rPr>
-                <w:sz w:val="20"/>
-              </w:rPr>
-              <w:t>코스별 예약 정보 사전 발송</w:t>
-            </w:r>
-          </w:p>
-        </w:tc>
-      </w:tr>
-      <w:tr>
-        <w:tc>
-          <w:tcPr>
-            <w:tcW w:type="dxa" w:w="4320"/>
-          </w:tcPr>
-          <w:p>
-            <w:r>
-              <w:rPr>
-                <w:sz w:val="20"/>
-              </w:rPr>
-              <w:t>카카오톡 긴급 연락</w:t>
-            </w:r>
-          </w:p>
-        </w:tc>
-        <w:tc>
-          <w:tcPr>
-            <w:tcW w:type="dxa" w:w="4320"/>
-          </w:tcPr>
-          <w:p>
-            <w:r>
-              <w:rPr>
-                <w:sz w:val="20"/>
-              </w:rPr>
-              <w:t>한국어 · 영어 응대</w:t>
-            </w:r>
-          </w:p>
-        </w:tc>
-      </w:tr>
-    </w:tbl>
-    <w:p/>
-    <w:p>
-      <w:pPr>
-        <w:pStyle w:val="Heading2"/>
-        <w:jc w:val="left"/>
-      </w:pPr>
-      <w:r>
-        <w:t>🗓️ 하루 스케줄</w:t>
+        <w:t>🗓️ 하루 일정</w:t>
       </w:r>
     </w:p>
     <w:tbl>
@@ -470,7 +93,7 @@
                 <w:b/>
                 <w:sz w:val="20"/>
               </w:rPr>
-              <w:t>비고</w:t>
+              <w:t>안내</w:t>
             </w:r>
           </w:p>
         </w:tc>
@@ -496,9 +119,43 @@
           <w:p>
             <w:r>
               <w:rPr>
+                <w:b/>
                 <w:sz w:val="20"/>
               </w:rPr>
               <w:t>퍼스널컬러 분석</w:t>
+            </w:r>
+          </w:p>
+          <w:p>
+            <w:pPr>
+              <w:spacing w:before="20"/>
+            </w:pPr>
+            <w:r>
+              <w:rPr>
+                <w:sz w:val="18"/>
+              </w:rPr>
+              <w:t>· 웜톤/쿨톤 세부 계절 유형 분류 (봄·여름·가을·겨울)</w:t>
+            </w:r>
+          </w:p>
+          <w:p>
+            <w:pPr>
+              <w:spacing w:before="20"/>
+            </w:pPr>
+            <w:r>
+              <w:rPr>
+                <w:sz w:val="18"/>
+              </w:rPr>
+              <w:t>· 얼굴형 분석</w:t>
+            </w:r>
+          </w:p>
+          <w:p>
+            <w:pPr>
+              <w:spacing w:before="20"/>
+            </w:pPr>
+            <w:r>
+              <w:rPr>
+                <w:sz w:val="18"/>
+              </w:rPr>
+              <w:t>· 체형 분석</w:t>
             </w:r>
           </w:p>
         </w:tc>
@@ -511,7 +168,7 @@
               <w:rPr>
                 <w:sz w:val="20"/>
               </w:rPr>
-              <w:t>포함</w:t>
+              <w:t>✅ 포함</w:t>
             </w:r>
           </w:p>
         </w:tc>
@@ -537,9 +194,43 @@
           <w:p>
             <w:r>
               <w:rPr>
+                <w:b/>
                 <w:sz w:val="20"/>
               </w:rPr>
               <w:t>올리브영 &amp; 약국 쇼핑</w:t>
+            </w:r>
+          </w:p>
+          <w:p>
+            <w:pPr>
+              <w:spacing w:before="20"/>
+            </w:pPr>
+            <w:r>
+              <w:rPr>
+                <w:sz w:val="18"/>
+              </w:rPr>
+              <w:t>· 퍼스널컬러 기반 맞춤 제품 추천</w:t>
+            </w:r>
+          </w:p>
+          <w:p>
+            <w:pPr>
+              <w:spacing w:before="20"/>
+            </w:pPr>
+            <w:r>
+              <w:rPr>
+                <w:sz w:val="18"/>
+              </w:rPr>
+              <w:t>· 명동 올리브영 메가스토어</w:t>
+            </w:r>
+          </w:p>
+          <w:p>
+            <w:pPr>
+              <w:spacing w:before="20"/>
+            </w:pPr>
+            <w:r>
+              <w:rPr>
+                <w:sz w:val="18"/>
+              </w:rPr>
+              <w:t>· 명동 인근 약국</w:t>
             </w:r>
           </w:p>
         </w:tc>
@@ -552,7 +243,7 @@
               <w:rPr>
                 <w:sz w:val="20"/>
               </w:rPr>
-              <w:t>쇼핑비 개별 결제</w:t>
+              <w:t>💳 쇼핑비 개별 결제</w:t>
             </w:r>
           </w:p>
         </w:tc>
@@ -578,9 +269,32 @@
           <w:p>
             <w:r>
               <w:rPr>
+                <w:b/>
                 <w:sz w:val="20"/>
               </w:rPr>
               <w:t>피부진단 &amp; 에스테틱</w:t>
+            </w:r>
+          </w:p>
+          <w:p>
+            <w:pPr>
+              <w:spacing w:before="20"/>
+            </w:pPr>
+            <w:r>
+              <w:rPr>
+                <w:sz w:val="18"/>
+              </w:rPr>
+              <w:t>· 전문 에스테티션 1:1 피부 진단</w:t>
+            </w:r>
+          </w:p>
+          <w:p>
+            <w:pPr>
+              <w:spacing w:before="20"/>
+            </w:pPr>
+            <w:r>
+              <w:rPr>
+                <w:sz w:val="18"/>
+              </w:rPr>
+              <w:t>· 기초 페이셜 클렌징 / 수분 앰플 집중 관리 / 블랙헤드 &amp; 모공 관리 중 택 1</w:t>
             </w:r>
           </w:p>
         </w:tc>
@@ -593,7 +307,7 @@
               <w:rPr>
                 <w:sz w:val="20"/>
               </w:rPr>
-              <w:t>시술비 개별 결제</w:t>
+              <w:t>💳 시술비 개별 결제</w:t>
             </w:r>
           </w:p>
         </w:tc>
@@ -619,9 +333,32 @@
           <w:p>
             <w:r>
               <w:rPr>
+                <w:b/>
                 <w:sz w:val="20"/>
               </w:rPr>
               <w:t>헤어 &amp; 메이크업</w:t>
+            </w:r>
+          </w:p>
+          <w:p>
+            <w:pPr>
+              <w:spacing w:before="20"/>
+            </w:pPr>
+            <w:r>
+              <w:rPr>
+                <w:sz w:val="18"/>
+              </w:rPr>
+              <w:t>· 명동 제휴 헤어숍 스타일링</w:t>
+            </w:r>
+          </w:p>
+          <w:p>
+            <w:pPr>
+              <w:spacing w:before="20"/>
+            </w:pPr>
+            <w:r>
+              <w:rPr>
+                <w:sz w:val="18"/>
+              </w:rPr>
+              <w:t>· 한국식 글로우 메이크업 풀코스</w:t>
             </w:r>
           </w:p>
         </w:tc>
@@ -634,7 +371,7 @@
               <w:rPr>
                 <w:sz w:val="20"/>
               </w:rPr>
-              <w:t>포함</w:t>
+              <w:t>✅ 포함</w:t>
             </w:r>
           </w:p>
         </w:tc>
@@ -660,9 +397,43 @@
           <w:p>
             <w:r>
               <w:rPr>
+                <w:b/>
                 <w:sz w:val="20"/>
               </w:rPr>
               <w:t>프로필 촬영</w:t>
+            </w:r>
+          </w:p>
+          <w:p>
+            <w:pPr>
+              <w:spacing w:before="20"/>
+            </w:pPr>
+            <w:r>
+              <w:rPr>
+                <w:sz w:val="18"/>
+              </w:rPr>
+              <w:t>· 명동 인근 실내 스튜디오</w:t>
+            </w:r>
+          </w:p>
+          <w:p>
+            <w:pPr>
+              <w:spacing w:before="20"/>
+            </w:pPr>
+            <w:r>
+              <w:rPr>
+                <w:sz w:val="18"/>
+              </w:rPr>
+              <w:t>· 전문 포토그래퍼 동행</w:t>
+            </w:r>
+          </w:p>
+          <w:p>
+            <w:pPr>
+              <w:spacing w:before="20"/>
+            </w:pPr>
+            <w:r>
+              <w:rPr>
+                <w:sz w:val="18"/>
+              </w:rPr>
+              <w:t>· 한국식 프로필 컷</w:t>
             </w:r>
           </w:p>
         </w:tc>
@@ -675,7 +446,7 @@
               <w:rPr>
                 <w:sz w:val="20"/>
               </w:rPr>
-              <w:t>포함</w:t>
+              <w:t>✅ 포함</w:t>
             </w:r>
           </w:p>
         </w:tc>
@@ -701,6 +472,7 @@
           <w:p>
             <w:r>
               <w:rPr>
+                <w:b/>
                 <w:sz w:val="20"/>
               </w:rPr>
               <w:t>해산</w:t>
@@ -721,10 +493,130 @@
           </w:p>
         </w:tc>
       </w:tr>
+      <w:tr>
+        <w:tc>
+          <w:tcPr>
+            <w:tcW w:type="dxa" w:w="2880"/>
+          </w:tcPr>
+          <w:p>
+            <w:r>
+              <w:rPr>
+                <w:sz w:val="20"/>
+              </w:rPr>
+              <w:t>별도 날짜</w:t>
+            </w:r>
+          </w:p>
+        </w:tc>
+        <w:tc>
+          <w:tcPr>
+            <w:tcW w:type="dxa" w:w="2880"/>
+          </w:tcPr>
+          <w:p>
+            <w:r>
+              <w:rPr>
+                <w:b/>
+                <w:sz w:val="20"/>
+              </w:rPr>
+              <w:t>명동 TOP5 병원 시술 예약 대행</w:t>
+            </w:r>
+          </w:p>
+          <w:p>
+            <w:pPr>
+              <w:spacing w:before="20"/>
+            </w:pPr>
+            <w:r>
+              <w:rPr>
+                <w:sz w:val="18"/>
+              </w:rPr>
+              <w:t>· 원하는 시술 + 날짜 선택</w:t>
+            </w:r>
+          </w:p>
+          <w:p>
+            <w:pPr>
+              <w:spacing w:before="20"/>
+            </w:pPr>
+            <w:r>
+              <w:rPr>
+                <w:sz w:val="18"/>
+              </w:rPr>
+              <w:t>· 피부과 · 성형외과 연결</w:t>
+            </w:r>
+          </w:p>
+          <w:p>
+            <w:pPr>
+              <w:spacing w:before="20"/>
+            </w:pPr>
+            <w:r>
+              <w:rPr>
+                <w:sz w:val="18"/>
+              </w:rPr>
+              <w:t>· 시술비는 병원 현장 결제</w:t>
+            </w:r>
+          </w:p>
+        </w:tc>
+        <w:tc>
+          <w:tcPr>
+            <w:tcW w:type="dxa" w:w="2880"/>
+          </w:tcPr>
+          <w:p>
+            <w:r>
+              <w:rPr>
+                <w:sz w:val="20"/>
+              </w:rPr>
+              <w:t>🏥 예약 대행</w:t>
+            </w:r>
+          </w:p>
+        </w:tc>
+      </w:tr>
     </w:tbl>
+    <w:p/>
     <w:p>
+      <w:pPr>
+        <w:pStyle w:val="Heading2"/>
+        <w:jc w:val="left"/>
+      </w:pPr>
       <w:r>
-        <w:t>※ 교통비는 개별 결제 (T-money 카드 제공)</w:t>
+        <w:t>🎁 여행 편의 키트</w:t>
+      </w:r>
+    </w:p>
+    <w:p>
+      <w:pPr>
+        <w:pStyle w:val="ListBullet"/>
+      </w:pPr>
+      <w:r>
+        <w:t>한국 eSIM (여행 기간 데이터)</w:t>
+      </w:r>
+    </w:p>
+    <w:p>
+      <w:pPr>
+        <w:pStyle w:val="ListBullet"/>
+      </w:pPr>
+      <w:r>
+        <w:t>T-money 교통카드</w:t>
+      </w:r>
+    </w:p>
+    <w:p>
+      <w:pPr>
+        <w:pStyle w:val="ListBullet"/>
+      </w:pPr>
+      <w:r>
+        <w:t>여행자 보험</w:t>
+      </w:r>
+    </w:p>
+    <w:p>
+      <w:pPr>
+        <w:pStyle w:val="ListBullet"/>
+      </w:pPr>
+      <w:r>
+        <w:t>코스별 예약 확인서</w:t>
+      </w:r>
+    </w:p>
+    <w:p>
+      <w:pPr>
+        <w:pStyle w:val="ListBullet"/>
+      </w:pPr>
+      <w:r>
+        <w:t>카카오톡 긴급 연락 (한국어 · 영어)</w:t>
       </w:r>
     </w:p>
     <w:p/>
@@ -734,65 +626,18 @@
         <w:jc w:val="left"/>
       </w:pPr>
       <w:r>
-        <w:t>🏥 병원 시술 예약 (별도)</w:t>
+        <w:t>💰 가격 안내</w:t>
       </w:r>
     </w:p>
     <w:p>
       <w:r>
-        <w:t xml:space="preserve">당일 코스와 별개로 </w:t>
-      </w:r>
-      <w:r>
         <w:rPr>
           <w:b/>
         </w:rPr>
-        <w:t>다른 날짜</w:t>
-      </w:r>
-      <w:r>
-        <w:t>에 명동 TOP5 피부과·성형외과 시술 예약을 도와드립니다.</w:t>
-      </w:r>
-    </w:p>
-    <w:p>
-      <w:pPr>
-        <w:pStyle w:val="ListBullet"/>
-      </w:pPr>
-      <w:r>
-        <w:t>원하는 시술 + 날짜 선택</w:t>
-      </w:r>
-    </w:p>
-    <w:p>
-      <w:pPr>
-        <w:pStyle w:val="ListBullet"/>
-      </w:pPr>
-      <w:r>
-        <w:t>영어 · 중국어 · 일본어 상담 가능 병원 연결</w:t>
-      </w:r>
-    </w:p>
-    <w:p>
-      <w:pPr>
-        <w:pStyle w:val="ListBullet"/>
-      </w:pPr>
-      <w:r>
-        <w:t>예약 확인서 발송</w:t>
-      </w:r>
-    </w:p>
-    <w:p>
-      <w:pPr>
-        <w:pStyle w:val="ListBullet"/>
-      </w:pPr>
-      <w:r>
-        <w:t>시술비는 병원 현장 결제</w:t>
+        <w:t>기본 패키지  ₩399,000</w:t>
       </w:r>
     </w:p>
     <w:p/>
-    <w:p>
-      <w:pPr>
-        <w:pStyle w:val="Heading2"/>
-        <w:jc w:val="left"/>
-      </w:pPr>
-      <w:r>
-        <w:t>💆 피부진단 &amp; 에스테틱 시술 메뉴 (현장 결제)</w:t>
-      </w:r>
-    </w:p>
     <w:tbl>
       <w:tblPr>
         <w:tblStyle w:val="TableGrid"/>
@@ -816,7 +661,7 @@
                 <w:b/>
                 <w:sz w:val="20"/>
               </w:rPr>
-              <w:t>시술</w:t>
+              <w:t>큐레이터 동행 구간</w:t>
             </w:r>
           </w:p>
         </w:tc>
@@ -831,7 +676,7 @@
                 <w:b/>
                 <w:sz w:val="20"/>
               </w:rPr>
-              <w:t>소요 시간</w:t>
+              <w:t>추가 요금</w:t>
             </w:r>
           </w:p>
         </w:tc>
@@ -846,7 +691,7 @@
                 <w:b/>
                 <w:sz w:val="20"/>
               </w:rPr>
-              <w:t>가격</w:t>
+              <w:t>총 금액</w:t>
             </w:r>
           </w:p>
         </w:tc>
@@ -861,7 +706,7 @@
               <w:rPr>
                 <w:sz w:val="20"/>
               </w:rPr>
-              <w:t>기초 페이셜 클렌징</w:t>
+              <w:t>없음</w:t>
             </w:r>
           </w:p>
         </w:tc>
@@ -874,7 +719,7 @@
               <w:rPr>
                 <w:sz w:val="20"/>
               </w:rPr>
-              <w:t>60분</w:t>
+              <w:t>—</w:t>
             </w:r>
           </w:p>
         </w:tc>
@@ -887,7 +732,7 @@
               <w:rPr>
                 <w:sz w:val="20"/>
               </w:rPr>
-              <w:t>₩50,000–80,000</w:t>
+              <w:t>₩399,000</w:t>
             </w:r>
           </w:p>
         </w:tc>
@@ -902,7 +747,7 @@
               <w:rPr>
                 <w:sz w:val="20"/>
               </w:rPr>
-              <w:t>수분 앰플 집중 관리</w:t>
+              <w:t>1구간</w:t>
             </w:r>
           </w:p>
         </w:tc>
@@ -915,7 +760,7 @@
               <w:rPr>
                 <w:sz w:val="20"/>
               </w:rPr>
-              <w:t>60분</w:t>
+              <w:t>+₩50,000</w:t>
             </w:r>
           </w:p>
         </w:tc>
@@ -928,7 +773,7 @@
               <w:rPr>
                 <w:sz w:val="20"/>
               </w:rPr>
-              <w:t>₩80,000–120,000</w:t>
+              <w:t>₩449,000</w:t>
             </w:r>
           </w:p>
         </w:tc>
@@ -943,7 +788,7 @@
               <w:rPr>
                 <w:sz w:val="20"/>
               </w:rPr>
-              <w:t>블랙헤드 &amp; 모공 관리</w:t>
+              <w:t>2구간</w:t>
             </w:r>
           </w:p>
         </w:tc>
@@ -956,7 +801,7 @@
               <w:rPr>
                 <w:sz w:val="20"/>
               </w:rPr>
-              <w:t>60분</w:t>
+              <w:t>+₩80,000</w:t>
             </w:r>
           </w:p>
         </w:tc>
@@ -969,70 +814,7 @@
               <w:rPr>
                 <w:sz w:val="20"/>
               </w:rPr>
-              <w:t>₩80,000–100,000</w:t>
-            </w:r>
-          </w:p>
-        </w:tc>
-      </w:tr>
-    </w:tbl>
-    <w:p/>
-    <w:p>
-      <w:pPr>
-        <w:pStyle w:val="Heading2"/>
-        <w:jc w:val="left"/>
-      </w:pPr>
-      <w:r>
-        <w:t>👩‍💼 큐레이터 동행 옵션</w:t>
-      </w:r>
-    </w:p>
-    <w:p>
-      <w:r>
-        <w:t>전담 큐레이터가 원하는 구간만 함께 이동하며 통역 · 쇼핑 가이드 · 병원 동행을 도와드립니다.</w:t>
-      </w:r>
-    </w:p>
-    <w:p>
-      <w:r>
-        <w:t>※ 구간은 반드시 연속으로 선택 (중간 건너뛰기 불가)</w:t>
-      </w:r>
-    </w:p>
-    <w:tbl>
-      <w:tblPr>
-        <w:tblStyle w:val="TableGrid"/>
-        <w:tblW w:type="auto" w:w="0"/>
-        <w:tblLook w:firstColumn="1" w:firstRow="1" w:lastColumn="0" w:lastRow="0" w:noHBand="0" w:noVBand="1" w:val="04A0"/>
-      </w:tblPr>
-      <w:tblGrid>
-        <w:gridCol w:w="4320"/>
-        <w:gridCol w:w="4320"/>
-      </w:tblGrid>
-      <w:tr>
-        <w:tc>
-          <w:tcPr>
-            <w:tcW w:type="dxa" w:w="4320"/>
-            <w:shd w:val="clear" w:color="auto" w:fill="D9E2F3"/>
-          </w:tcPr>
-          <w:p>
-            <w:r>
-              <w:rPr>
-                <w:b/>
-                <w:sz w:val="20"/>
-              </w:rPr>
-              <w:t>동행 구간</w:t>
-            </w:r>
-          </w:p>
-        </w:tc>
-        <w:tc>
-          <w:tcPr>
-            <w:tcW w:type="dxa" w:w="4320"/>
-            <w:shd w:val="clear" w:color="auto" w:fill="D9E2F3"/>
-          </w:tcPr>
-          <w:p>
-            <w:r>
-              <w:rPr>
-                <w:b/>
-                <w:sz w:val="20"/>
-              </w:rPr>
-              <w:t>추가 요금</w:t>
+              <w:t>₩479,000</w:t>
             </w:r>
           </w:p>
         </w:tc>
@@ -1040,63 +822,7 @@
       <w:tr>
         <w:tc>
           <w:tcPr>
-            <w:tcW w:type="dxa" w:w="4320"/>
-          </w:tcPr>
-          <w:p>
-            <w:r>
-              <w:rPr>
-                <w:sz w:val="20"/>
-              </w:rPr>
-              <w:t>1구간</w:t>
-            </w:r>
-          </w:p>
-        </w:tc>
-        <w:tc>
-          <w:tcPr>
-            <w:tcW w:type="dxa" w:w="4320"/>
-          </w:tcPr>
-          <w:p>
-            <w:r>
-              <w:rPr>
-                <w:sz w:val="20"/>
-              </w:rPr>
-              <w:t>₩50,000</w:t>
-            </w:r>
-          </w:p>
-        </w:tc>
-      </w:tr>
-      <w:tr>
-        <w:tc>
-          <w:tcPr>
-            <w:tcW w:type="dxa" w:w="4320"/>
-          </w:tcPr>
-          <w:p>
-            <w:r>
-              <w:rPr>
-                <w:sz w:val="20"/>
-              </w:rPr>
-              <w:t>2구간</w:t>
-            </w:r>
-          </w:p>
-        </w:tc>
-        <w:tc>
-          <w:tcPr>
-            <w:tcW w:type="dxa" w:w="4320"/>
-          </w:tcPr>
-          <w:p>
-            <w:r>
-              <w:rPr>
-                <w:sz w:val="20"/>
-              </w:rPr>
-              <w:t>₩80,000</w:t>
-            </w:r>
-          </w:p>
-        </w:tc>
-      </w:tr>
-      <w:tr>
-        <w:tc>
-          <w:tcPr>
-            <w:tcW w:type="dxa" w:w="4320"/>
+            <w:tcW w:type="dxa" w:w="2880"/>
           </w:tcPr>
           <w:p>
             <w:r>
@@ -1109,14 +835,27 @@
         </w:tc>
         <w:tc>
           <w:tcPr>
-            <w:tcW w:type="dxa" w:w="4320"/>
+            <w:tcW w:type="dxa" w:w="2880"/>
           </w:tcPr>
           <w:p>
             <w:r>
               <w:rPr>
                 <w:sz w:val="20"/>
               </w:rPr>
-              <w:t>₩110,000</w:t>
+              <w:t>+₩110,000</w:t>
+            </w:r>
+          </w:p>
+        </w:tc>
+        <w:tc>
+          <w:tcPr>
+            <w:tcW w:type="dxa" w:w="2880"/>
+          </w:tcPr>
+          <w:p>
+            <w:r>
+              <w:rPr>
+                <w:sz w:val="20"/>
+              </w:rPr>
+              <w:t>₩509,000</w:t>
             </w:r>
           </w:p>
         </w:tc>
@@ -1124,7 +863,7 @@
       <w:tr>
         <w:tc>
           <w:tcPr>
-            <w:tcW w:type="dxa" w:w="4320"/>
+            <w:tcW w:type="dxa" w:w="2880"/>
           </w:tcPr>
           <w:p>
             <w:r>
@@ -1137,14 +876,27 @@
         </w:tc>
         <w:tc>
           <w:tcPr>
-            <w:tcW w:type="dxa" w:w="4320"/>
+            <w:tcW w:type="dxa" w:w="2880"/>
           </w:tcPr>
           <w:p>
             <w:r>
               <w:rPr>
                 <w:sz w:val="20"/>
               </w:rPr>
-              <w:t>₩130,000</w:t>
+              <w:t>+₩130,000</w:t>
+            </w:r>
+          </w:p>
+        </w:tc>
+        <w:tc>
+          <w:tcPr>
+            <w:tcW w:type="dxa" w:w="2880"/>
+          </w:tcPr>
+          <w:p>
+            <w:r>
+              <w:rPr>
+                <w:sz w:val="20"/>
+              </w:rPr>
+              <w:t>₩529,000</w:t>
             </w:r>
           </w:p>
         </w:tc>
@@ -1152,7 +904,7 @@
       <w:tr>
         <w:tc>
           <w:tcPr>
-            <w:tcW w:type="dxa" w:w="4320"/>
+            <w:tcW w:type="dxa" w:w="2880"/>
           </w:tcPr>
           <w:p>
             <w:r>
@@ -1165,137 +917,40 @@
         </w:tc>
         <w:tc>
           <w:tcPr>
-            <w:tcW w:type="dxa" w:w="4320"/>
+            <w:tcW w:type="dxa" w:w="2880"/>
           </w:tcPr>
           <w:p>
             <w:r>
               <w:rPr>
                 <w:sz w:val="20"/>
               </w:rPr>
-              <w:t>₩150,000</w:t>
+              <w:t>+₩150,000</w:t>
+            </w:r>
+          </w:p>
+        </w:tc>
+        <w:tc>
+          <w:tcPr>
+            <w:tcW w:type="dxa" w:w="2880"/>
+          </w:tcPr>
+          <w:p>
+            <w:r>
+              <w:rPr>
+                <w:sz w:val="20"/>
+              </w:rPr>
+              <w:t>₩549,000</w:t>
             </w:r>
           </w:p>
         </w:tc>
       </w:tr>
     </w:tbl>
-    <w:p/>
     <w:p>
-      <w:pPr>
-        <w:pStyle w:val="ListBullet"/>
-      </w:pPr>
       <w:r>
-        <w:rPr>
-          <w:b/>
-        </w:rPr>
-        <w:t>큐레이터 제공 서비스</w:t>
+        <w:t>※ 큐레이터는 원하는 구간만 연속으로 선택 가능합니다</w:t>
       </w:r>
     </w:p>
     <w:p>
-      <w:pPr>
-        <w:pStyle w:val="ListBullet"/>
-      </w:pPr>
       <w:r>
-        <w:t>영어 · 중국어 · 일본어 통역</w:t>
-      </w:r>
-    </w:p>
-    <w:p>
-      <w:pPr>
-        <w:pStyle w:val="ListBullet"/>
-      </w:pPr>
-      <w:r>
-        <w:t>퍼스널컬러 기반 쇼핑 1:1 추천</w:t>
-      </w:r>
-    </w:p>
-    <w:p>
-      <w:pPr>
-        <w:pStyle w:val="ListBullet"/>
-      </w:pPr>
-      <w:r>
-        <w:t>피부과 · 에스테틱 상담 동행</w:t>
-      </w:r>
-    </w:p>
-    <w:p/>
-    <w:p>
-      <w:pPr>
-        <w:pStyle w:val="Heading2"/>
-        <w:jc w:val="left"/>
-      </w:pPr>
-      <w:r>
-        <w:t>❌ 포함되지 않는 것</w:t>
-      </w:r>
-    </w:p>
-    <w:p>
-      <w:pPr>
-        <w:pStyle w:val="ListBullet"/>
-      </w:pPr>
-      <w:r>
-        <w:t>교통비 (지하철 · 택시)</w:t>
-      </w:r>
-    </w:p>
-    <w:p>
-      <w:pPr>
-        <w:pStyle w:val="ListBullet"/>
-      </w:pPr>
-      <w:r>
-        <w:t>점심식사</w:t>
-      </w:r>
-    </w:p>
-    <w:p>
-      <w:pPr>
-        <w:pStyle w:val="ListBullet"/>
-      </w:pPr>
-      <w:r>
-        <w:t>올리브영 · 약국 쇼핑비</w:t>
-      </w:r>
-    </w:p>
-    <w:p>
-      <w:pPr>
-        <w:pStyle w:val="ListBullet"/>
-      </w:pPr>
-      <w:r>
-        <w:t>에스테틱 시술비</w:t>
-      </w:r>
-    </w:p>
-    <w:p>
-      <w:pPr>
-        <w:pStyle w:val="ListBullet"/>
-      </w:pPr>
-      <w:r>
-        <w:t>병원 시술비</w:t>
-      </w:r>
-    </w:p>
-    <w:p/>
-    <w:p>
-      <w:pPr>
-        <w:pStyle w:val="Heading2"/>
-        <w:jc w:val="left"/>
-      </w:pPr>
-      <w:r>
-        <w:t>📌 예약 안내</w:t>
-      </w:r>
-    </w:p>
-    <w:p>
-      <w:pPr>
-        <w:pStyle w:val="ListBullet"/>
-      </w:pPr>
-      <w:r>
-        <w:t>최소 3일 전 예약 필요</w:t>
-      </w:r>
-    </w:p>
-    <w:p>
-      <w:pPr>
-        <w:pStyle w:val="ListBullet"/>
-      </w:pPr>
-      <w:r>
-        <w:t>카카오톡 채널 또는 이메일로 문의</w:t>
-      </w:r>
-    </w:p>
-    <w:p>
-      <w:pPr>
-        <w:pStyle w:val="ListBullet"/>
-      </w:pPr>
-      <w:r>
-        <w:t>병원 시술 예약은 5일 전 요청 권장</w:t>
+        <w:t>※ 지원 언어: 영어 · 중국어 · 일본어</w:t>
       </w:r>
     </w:p>
     <w:sectPr>

</xml_diff>